<commit_message>
Worksheet D15 to the group's rule; one-page E summary
D15 now states the agreed counting measure and label rule, and proposes an
input-synapse tie-break (settles 223 of FAFB's 232 exact ties). New
reports/eda_E_summary.md/.docx: the one-page summary the EDA plan asks for.
Both docx builders now strip only the markdown delimiters.

Co-Authored-By: Claude Opus 5.5 (1M context) <noreply@anthropic.com>
Claude-Session: https://claude.ai/code/session_018aDVHTWSF7cRpqRvzKCL4o
</commit_message>
<xml_diff>
--- a/reports/decision_worksheet_P5.docx
+++ b/reports/decision_worksheet_P5.docx
@@ -6,7 +6,7 @@
       <w:r>
         <w:rPr>
           <w:b/>
-          <w:sz w:val="22"/>
+          <w:sz w:val="21"/>
         </w:rPr>
         <w:t>Pre-Session Decision Worksheet — Weeks 2 and 3 (Project 5)</w:t>
       </w:r>
@@ -16,7 +16,7 @@
         <w:rPr>
           <w:b w:val="0"/>
         </w:rPr>
-        <w:t xml:space="preserve">Tarkan Eyerci · 14.10.2026 · Evidence: FAFB 783, annotations v3.2.0, Buhmann synapses, and MaleCNS v1.0 (Traced, confidence ≥ 0.5; brain part where compared with FAFB), from the caches in this repository. The hemibrain (E6 only) is the public v1.2 export. "Central" means </w:t>
+        <w:t xml:space="preserve">Tarkan Eyerci · 15.10.2026 · Evidence: FAFB 783, annotations v3.2.0, Buhmann synapses, and MaleCNS v1.0 (Traced, confidence ≥ 0.5; brain part where compared with FAFB), from the caches in this repository. The hemibrain (E6 only) is the public v1.2 export. "Central" means </w:t>
       </w:r>
       <w:r>
         <w:rPr>
@@ -1402,7 +1402,7 @@
               <w:rPr>
                 <w:b w:val="0"/>
               </w:rPr>
-              <w:t>Most synapses (inputs + outputs, all synapses); ties → most input synapses → alphabetical</w:t>
+              <w:t>Most synapses, counting connections on both sides (MaleCNS roiInfo upstream + downstream, FAFB per-neuron counts, all partners); a label outside the named neuropils can win, with region_group unknown (agreed in the group, 2026-10-15; two rows to add to eda_shared); ties → more input synapses → alphabetical</w:t>
             </w:r>
           </w:p>
         </w:tc>
@@ -1416,7 +1416,7 @@
               <w:rPr>
                 <w:b w:val="0"/>
               </w:rPr>
-              <w:t>weak</w:t>
+              <w:t>strong (tie rule: weak)</w:t>
             </w:r>
           </w:p>
         </w:tc>
@@ -1430,7 +1430,7 @@
               <w:rPr>
                 <w:b w:val="0"/>
               </w:rPr>
-              <w:t>It needs no extra data, and the tie rule is deterministic</w:t>
+              <w:t>Both datasets must count the same unit, and FAFB counts connections; an input tie-break settles ties by data, not by spelling</w:t>
             </w:r>
           </w:p>
         </w:tc>
@@ -1444,7 +1444,7 @@
               <w:rPr>
                 <w:b w:val="0"/>
               </w:rPr>
-              <w:t xml:space="preserve">232 exact ties; </w:t>
+              <w:t xml:space="preserve">FlyWire per-neuron output and input totals are equal (130,054,535 each). E1 (central neurons, named neuropils): </w:t>
             </w:r>
             <w:r>
               <w:rPr>
@@ -1456,7 +1456,7 @@
               <w:rPr>
                 <w:b w:val="0"/>
               </w:rPr>
-              <w:t xml:space="preserve"> of central neurons (11,268) have a top-vs-second gap below 0.10 (E1); MaleCNS 72 ties, </w:t>
+              <w:t xml:space="preserve"> (FAFB, 11,268) and </w:t>
             </w:r>
             <w:r>
               <w:rPr>
@@ -1468,7 +1468,55 @@
               <w:rPr>
                 <w:b w:val="0"/>
               </w:rPr>
-              <w:t xml:space="preserve"> (8,677)</w:t>
+              <w:t xml:space="preserve"> (MaleCNS, 8,682) have a top-vs-second gap below 0.10. Exact ties in the region assignment (all neurons, all partners): FAFB 232, MaleCNS 90; more input synapses settles </w:t>
+            </w:r>
+            <w:r>
+              <w:rPr>
+                <w:b/>
+              </w:rPr>
+              <w:t>223 of the 232</w:t>
+            </w:r>
+            <w:r>
+              <w:rPr>
+                <w:b w:val="0"/>
+              </w:rPr>
+              <w:t xml:space="preserve"> FAFB ties (153 differ from alphabetical). Alphabetical is fragile: respelling </w:t>
+            </w:r>
+            <w:r>
+              <w:rPr>
+                <w:b w:val="0"/>
+              </w:rPr>
+              <w:t>&lt;unspecified&gt;</w:t>
+            </w:r>
+            <w:r>
+              <w:rPr>
+                <w:b w:val="0"/>
+              </w:rPr>
+              <w:t xml:space="preserve"> moved 6 MaleCNS neurons. 750 MaleCNS neurons get an unspecified brain label as region (230 more </w:t>
+            </w:r>
+            <w:r>
+              <w:rPr>
+                <w:b w:val="0"/>
+              </w:rPr>
+              <w:t>VNC-unspecified</w:t>
+            </w:r>
+            <w:r>
+              <w:rPr>
+                <w:b w:val="0"/>
+              </w:rPr>
+              <w:t>, nerve cord) and 6 FAFB neurons UNASGD (</w:t>
+            </w:r>
+            <w:r>
+              <w:rPr>
+                <w:b w:val="0"/>
+              </w:rPr>
+              <w:t>reports/region_rules.md</w:t>
+            </w:r>
+            <w:r>
+              <w:rPr>
+                <w:b w:val="0"/>
+              </w:rPr>
+              <w:t>)</w:t>
             </w:r>
           </w:p>
         </w:tc>
@@ -1927,7 +1975,7 @@
         <w:rPr>
           <w:b w:val="0"/>
         </w:rPr>
-        <w:t xml:space="preserve">; FAFB </w:t>
+        <w:t xml:space="preserve"> (spelled UNASGD here; eda_shared then gives it in_brain False); FAFB </w:t>
       </w:r>
       <w:r>
         <w:rPr>
@@ -2380,7 +2428,7 @@
     </w:pPr>
     <w:rPr>
       <w:rFonts w:ascii="Calibri" w:hAnsi="Calibri"/>
-      <w:sz w:val="14"/>
+      <w:sz w:val="13"/>
     </w:rPr>
   </w:style>
   <w:style w:type="paragraph" w:styleId="Header">

</xml_diff>